<commit_message>
Add CLM diagnosis interview protocol and route choice
</commit_message>
<xml_diff>
--- a/technologies/06_CLM/30 Документация/20 Сессия/Управление_Директорами_CLM_Продукт_02_Сессия_внутренний_протокол_V1.docx
+++ b/technologies/06_CLM/30 Документация/20 Сессия/Управление_Директорами_CLM_Продукт_02_Сессия_внутренний_протокол_V1.docx
@@ -61,7 +61,7 @@
     </w:p>
     <w:p>
       <w:r>
-        <w:t>Сессия не является обсуждением всего найденного. Ее задача - выбрать, что реально делать дальше, кто владелец, какой эффект нужен и какой Спринт запускается.</w:t>
+        <w:t>Сессия не является обсуждением всего найденного. Ее задача - выбрать, что реально делать дальше, кто владелец, какой эффект нужен, какой Спринт требуется и кто его реализует.</w:t>
       </w:r>
     </w:p>
     <w:tbl>
@@ -1579,8 +1579,7 @@
         </w:numPr>
       </w:pPr>
       <w:r>
-        <w:rPr/>
-        <w:t xml:space="preserve">Паспорт Спринта полный и утвержден: перейти в Спринт.</w:t>
+        <w:t>Паспорт Спринта полный и утвержден: заказчик выбирает Спринт с консультантом либо самостоятельную реализацию по Паспорту.</w:t>
       </w:r>
     </w:p>
     <w:p>
@@ -1615,8 +1614,7 @@
         </w:numPr>
       </w:pPr>
       <w:r>
-        <w:rPr/>
-        <w:t xml:space="preserve">Прямой переход из Сессии в Сопровождение запрещен.</w:t>
+        <w:t>Самостоятельная реализация завершает текущий консультационный цикл на Сессии. Прямой переход из Сессии в Сопровождение запрещен: Сопровождение открывается только после подтвержденного внедрения результата Спринта.</w:t>
       </w:r>
     </w:p>
     <w:sectPr>

</xml_diff>